<commit_message>
Revise assignment 5 intro
</commit_message>
<xml_diff>
--- a/assignments/26_03_01_GGS590_GeoAI_Assignment5.docx
+++ b/assignments/26_03_01_GGS590_GeoAI_Assignment5.docx
@@ -165,7 +165,19 @@
         <w:rPr>
           <w:rFonts w:ascii="Times New Roman" w:hAnsi="Times New Roman" w:cs="Times New Roman"/>
         </w:rPr>
-        <w:t>In Week 5, we explored the use of AI tools to accelerate GIS workflow development. While such tools can improve efficiency, they do not replace the need for methodological understanding</w:t>
+        <w:t xml:space="preserve">In Week </w:t>
+      </w:r>
+      <w:r>
+        <w:rPr>
+          <w:rFonts w:ascii="Times New Roman" w:hAnsi="Times New Roman" w:cs="Times New Roman"/>
+        </w:rPr>
+        <w:t>6</w:t>
+      </w:r>
+      <w:r>
+        <w:rPr>
+          <w:rFonts w:ascii="Times New Roman" w:hAnsi="Times New Roman" w:cs="Times New Roman"/>
+        </w:rPr>
+        <w:t>, we explored the use of AI tools to accelerate GIS workflow development. While such tools can improve efficiency, they do not replace the need for methodological understanding</w:t>
       </w:r>
       <w:r>
         <w:rPr>
@@ -413,13 +425,7 @@
         <w:rPr>
           <w:rFonts w:ascii="Times New Roman" w:hAnsi="Times New Roman" w:cs="Times New Roman"/>
         </w:rPr>
-        <w:t xml:space="preserve"> </w:t>
-      </w:r>
-      <w:r>
-        <w:rPr>
-          <w:rFonts w:ascii="Times New Roman" w:hAnsi="Times New Roman" w:cs="Times New Roman"/>
-        </w:rPr>
-        <w:t>(25 points)</w:t>
+        <w:t xml:space="preserve"> (25 points)</w:t>
       </w:r>
     </w:p>
     <w:p>
@@ -443,13 +449,7 @@
         <w:rPr>
           <w:rFonts w:ascii="Times New Roman" w:hAnsi="Times New Roman" w:cs="Times New Roman"/>
         </w:rPr>
-        <w:t xml:space="preserve"> </w:t>
-      </w:r>
-      <w:r>
-        <w:rPr>
-          <w:rFonts w:ascii="Times New Roman" w:hAnsi="Times New Roman" w:cs="Times New Roman"/>
-        </w:rPr>
-        <w:t>(25 points)</w:t>
+        <w:t xml:space="preserve"> (25 points)</w:t>
       </w:r>
     </w:p>
     <w:p>
@@ -473,13 +473,7 @@
         <w:rPr>
           <w:rFonts w:ascii="Times New Roman" w:hAnsi="Times New Roman" w:cs="Times New Roman"/>
         </w:rPr>
-        <w:t xml:space="preserve">, different from Land Use/Land Cover) </w:t>
-      </w:r>
-      <w:r>
-        <w:rPr>
-          <w:rFonts w:ascii="Times New Roman" w:hAnsi="Times New Roman" w:cs="Times New Roman"/>
-        </w:rPr>
-        <w:t>(25 points)</w:t>
+        <w:t>, different from Land Use/Land Cover) (25 points)</w:t>
       </w:r>
     </w:p>
     <w:p>

</xml_diff>

<commit_message>
Add updated assignment hand-in date
</commit_message>
<xml_diff>
--- a/assignments/26_03_01_GGS590_GeoAI_Assignment5.docx
+++ b/assignments/26_03_01_GGS590_GeoAI_Assignment5.docx
@@ -59,12 +59,21 @@
         </w:rPr>
         <w:t xml:space="preserve"> </w:t>
       </w:r>
+      <w:proofErr w:type="spellStart"/>
       <w:r>
         <w:rPr>
           <w:rFonts w:ascii="Times New Roman" w:hAnsi="Times New Roman" w:cs="Times New Roman"/>
           <w:u w:val="single"/>
         </w:rPr>
-        <w:t xml:space="preserve">GeoAI </w:t>
+        <w:t>GeoAI</w:t>
+      </w:r>
+      <w:proofErr w:type="spellEnd"/>
+      <w:r>
+        <w:rPr>
+          <w:rFonts w:ascii="Times New Roman" w:hAnsi="Times New Roman" w:cs="Times New Roman"/>
+          <w:u w:val="single"/>
+        </w:rPr>
+        <w:t xml:space="preserve"> </w:t>
       </w:r>
       <w:r>
         <w:rPr>
@@ -122,7 +131,7 @@
           <w:rFonts w:ascii="Times New Roman" w:hAnsi="Times New Roman" w:cs="Times New Roman"/>
           <w:u w:val="single"/>
         </w:rPr>
-        <w:t>6</w:t>
+        <w:t>7</w:t>
       </w:r>
       <w:r>
         <w:rPr>
@@ -189,7 +198,21 @@
         <w:rPr>
           <w:rFonts w:ascii="Times New Roman" w:hAnsi="Times New Roman" w:cs="Times New Roman"/>
         </w:rPr>
-        <w:t>. This assignment is designed to assess your ability to move beyond automation and demonstrate genuine conceptual and analytical mastery of a classical machine learning approach within a GeoAI context.</w:t>
+        <w:t xml:space="preserve">. This assignment is designed to assess your ability to move beyond automation and demonstrate genuine conceptual and analytical mastery of a classical machine learning approach within a </w:t>
+      </w:r>
+      <w:proofErr w:type="spellStart"/>
+      <w:r>
+        <w:rPr>
+          <w:rFonts w:ascii="Times New Roman" w:hAnsi="Times New Roman" w:cs="Times New Roman"/>
+        </w:rPr>
+        <w:t>GeoAI</w:t>
+      </w:r>
+      <w:proofErr w:type="spellEnd"/>
+      <w:r>
+        <w:rPr>
+          <w:rFonts w:ascii="Times New Roman" w:hAnsi="Times New Roman" w:cs="Times New Roman"/>
+        </w:rPr>
+        <w:t xml:space="preserve"> context.</w:t>
       </w:r>
     </w:p>
     <w:p>
@@ -733,7 +756,21 @@
         <w:rPr>
           <w:rFonts w:ascii="Times New Roman" w:hAnsi="Times New Roman" w:cs="Times New Roman"/>
         </w:rPr>
-        <w:t>Please write your analysis in a Google Colab notebook and then use the print function to save it to a .pdf file for submission</w:t>
+        <w:t xml:space="preserve">Please write your analysis in a Google </w:t>
+      </w:r>
+      <w:proofErr w:type="spellStart"/>
+      <w:r>
+        <w:rPr>
+          <w:rFonts w:ascii="Times New Roman" w:hAnsi="Times New Roman" w:cs="Times New Roman"/>
+        </w:rPr>
+        <w:t>Colab</w:t>
+      </w:r>
+      <w:proofErr w:type="spellEnd"/>
+      <w:r>
+        <w:rPr>
+          <w:rFonts w:ascii="Times New Roman" w:hAnsi="Times New Roman" w:cs="Times New Roman"/>
+        </w:rPr>
+        <w:t xml:space="preserve"> notebook and then use the print function to save it to a .pdf file for submission</w:t>
       </w:r>
       <w:r>
         <w:rPr>
@@ -1194,8 +1231,20 @@
         <w:sz w:val="18"/>
         <w:szCs w:val="18"/>
       </w:rPr>
-      <w:t>GGS590 GeoAI</w:t>
+      <w:t xml:space="preserve">GGS590 </w:t>
     </w:r>
+    <w:proofErr w:type="spellStart"/>
+    <w:r>
+      <w:rPr>
+        <w:rFonts w:ascii="Times New Roman" w:hAnsi="Times New Roman" w:cs="Times New Roman"/>
+        <w:i/>
+        <w:iCs/>
+        <w:sz w:val="18"/>
+        <w:szCs w:val="18"/>
+      </w:rPr>
+      <w:t>GeoAI</w:t>
+    </w:r>
+    <w:proofErr w:type="spellEnd"/>
   </w:p>
 </w:hdr>
 </file>

</xml_diff>